<commit_message>
Module 6 preise en main de testeur
</commit_message>
<xml_diff>
--- a/Prise en main du metier de testeur/Remonter_les_anomalies_M5.docx
+++ b/Prise en main du metier de testeur/Remonter_les_anomalies_M5.docx
@@ -164,7 +164,7 @@
         </w:p>
         <w:p>
           <w:pPr>
-            <w:pStyle w:val="TM2"/>
+            <w:pStyle w:val="TM1"/>
             <w:tabs>
               <w:tab w:val="right" w:leader="dot" w:pos="9062"/>
             </w:tabs>
@@ -183,13 +183,13 @@
           <w:r>
             <w:fldChar w:fldCharType="separate"/>
           </w:r>
-          <w:hyperlink w:anchor="_Toc230679305" w:history="1">
+          <w:hyperlink w:anchor="_Toc234269217" w:history="1">
             <w:r>
               <w:rPr>
                 <w:rStyle w:val="Lienhypertexte"/>
                 <w:noProof/>
               </w:rPr>
-              <w:t>Exemples « d’Algo » dans la vie de tous les jours</w:t>
+              <w:t>Un peu de vocabulaire</w:t>
             </w:r>
             <w:r>
               <w:rPr>
@@ -210,7 +210,7 @@
                 <w:noProof/>
                 <w:webHidden/>
               </w:rPr>
-              <w:instrText xml:space="preserve"> PAGEREF _Toc230679305 \h </w:instrText>
+              <w:instrText xml:space="preserve"> PAGEREF _Toc234269217 \h </w:instrText>
             </w:r>
             <w:r>
               <w:rPr>
@@ -253,13 +253,13 @@
               <w:lang w:eastAsia="fr-FR"/>
             </w:rPr>
           </w:pPr>
-          <w:hyperlink w:anchor="_Toc230679306" w:history="1">
+          <w:hyperlink w:anchor="_Toc234269218" w:history="1">
             <w:r>
               <w:rPr>
                 <w:rStyle w:val="Lienhypertexte"/>
                 <w:noProof/>
               </w:rPr>
-              <w:t>Définition et objectif de l’algorithmique</w:t>
+              <w:t>Le traitement des anomalies</w:t>
             </w:r>
             <w:r>
               <w:rPr>
@@ -280,7 +280,357 @@
                 <w:noProof/>
                 <w:webHidden/>
               </w:rPr>
-              <w:instrText xml:space="preserve"> PAGEREF _Toc230679306 \h </w:instrText>
+              <w:instrText xml:space="preserve"> PAGEREF _Toc234269218 \h </w:instrText>
+            </w:r>
+            <w:r>
+              <w:rPr>
+                <w:noProof/>
+                <w:webHidden/>
+              </w:rPr>
+            </w:r>
+            <w:r>
+              <w:rPr>
+                <w:noProof/>
+                <w:webHidden/>
+              </w:rPr>
+              <w:fldChar w:fldCharType="separate"/>
+            </w:r>
+            <w:r>
+              <w:rPr>
+                <w:noProof/>
+                <w:webHidden/>
+              </w:rPr>
+              <w:t>3</w:t>
+            </w:r>
+            <w:r>
+              <w:rPr>
+                <w:noProof/>
+                <w:webHidden/>
+              </w:rPr>
+              <w:fldChar w:fldCharType="end"/>
+            </w:r>
+          </w:hyperlink>
+        </w:p>
+        <w:p>
+          <w:pPr>
+            <w:pStyle w:val="TM2"/>
+            <w:tabs>
+              <w:tab w:val="right" w:leader="dot" w:pos="9062"/>
+            </w:tabs>
+            <w:rPr>
+              <w:rFonts w:eastAsiaTheme="minorEastAsia"/>
+              <w:noProof/>
+              <w:lang w:eastAsia="fr-FR"/>
+            </w:rPr>
+          </w:pPr>
+          <w:hyperlink w:anchor="_Toc234269219" w:history="1">
+            <w:r>
+              <w:rPr>
+                <w:rStyle w:val="Lienhypertexte"/>
+                <w:noProof/>
+              </w:rPr>
+              <w:t>Une anomalie</w:t>
+            </w:r>
+            <w:r>
+              <w:rPr>
+                <w:noProof/>
+                <w:webHidden/>
+              </w:rPr>
+              <w:tab/>
+            </w:r>
+            <w:r>
+              <w:rPr>
+                <w:noProof/>
+                <w:webHidden/>
+              </w:rPr>
+              <w:fldChar w:fldCharType="begin"/>
+            </w:r>
+            <w:r>
+              <w:rPr>
+                <w:noProof/>
+                <w:webHidden/>
+              </w:rPr>
+              <w:instrText xml:space="preserve"> PAGEREF _Toc234269219 \h </w:instrText>
+            </w:r>
+            <w:r>
+              <w:rPr>
+                <w:noProof/>
+                <w:webHidden/>
+              </w:rPr>
+            </w:r>
+            <w:r>
+              <w:rPr>
+                <w:noProof/>
+                <w:webHidden/>
+              </w:rPr>
+              <w:fldChar w:fldCharType="separate"/>
+            </w:r>
+            <w:r>
+              <w:rPr>
+                <w:noProof/>
+                <w:webHidden/>
+              </w:rPr>
+              <w:t>3</w:t>
+            </w:r>
+            <w:r>
+              <w:rPr>
+                <w:noProof/>
+                <w:webHidden/>
+              </w:rPr>
+              <w:fldChar w:fldCharType="end"/>
+            </w:r>
+          </w:hyperlink>
+        </w:p>
+        <w:p>
+          <w:pPr>
+            <w:pStyle w:val="TM2"/>
+            <w:tabs>
+              <w:tab w:val="right" w:leader="dot" w:pos="9062"/>
+            </w:tabs>
+            <w:rPr>
+              <w:rFonts w:eastAsiaTheme="minorEastAsia"/>
+              <w:noProof/>
+              <w:lang w:eastAsia="fr-FR"/>
+            </w:rPr>
+          </w:pPr>
+          <w:hyperlink w:anchor="_Toc234269220" w:history="1">
+            <w:r>
+              <w:rPr>
+                <w:rStyle w:val="Lienhypertexte"/>
+                <w:noProof/>
+              </w:rPr>
+              <w:t>Cycle de vie d’une anomalie</w:t>
+            </w:r>
+            <w:r>
+              <w:rPr>
+                <w:noProof/>
+                <w:webHidden/>
+              </w:rPr>
+              <w:tab/>
+            </w:r>
+            <w:r>
+              <w:rPr>
+                <w:noProof/>
+                <w:webHidden/>
+              </w:rPr>
+              <w:fldChar w:fldCharType="begin"/>
+            </w:r>
+            <w:r>
+              <w:rPr>
+                <w:noProof/>
+                <w:webHidden/>
+              </w:rPr>
+              <w:instrText xml:space="preserve"> PAGEREF _Toc234269220 \h </w:instrText>
+            </w:r>
+            <w:r>
+              <w:rPr>
+                <w:noProof/>
+                <w:webHidden/>
+              </w:rPr>
+            </w:r>
+            <w:r>
+              <w:rPr>
+                <w:noProof/>
+                <w:webHidden/>
+              </w:rPr>
+              <w:fldChar w:fldCharType="separate"/>
+            </w:r>
+            <w:r>
+              <w:rPr>
+                <w:noProof/>
+                <w:webHidden/>
+              </w:rPr>
+              <w:t>4</w:t>
+            </w:r>
+            <w:r>
+              <w:rPr>
+                <w:noProof/>
+                <w:webHidden/>
+              </w:rPr>
+              <w:fldChar w:fldCharType="end"/>
+            </w:r>
+          </w:hyperlink>
+        </w:p>
+        <w:p>
+          <w:pPr>
+            <w:pStyle w:val="TM1"/>
+            <w:tabs>
+              <w:tab w:val="right" w:leader="dot" w:pos="9062"/>
+            </w:tabs>
+            <w:rPr>
+              <w:rFonts w:eastAsiaTheme="minorEastAsia"/>
+              <w:noProof/>
+              <w:lang w:eastAsia="fr-FR"/>
+            </w:rPr>
+          </w:pPr>
+          <w:hyperlink w:anchor="_Toc234269221" w:history="1">
+            <w:r>
+              <w:rPr>
+                <w:rStyle w:val="Lienhypertexte"/>
+                <w:noProof/>
+              </w:rPr>
+              <w:t>Remonter les anomalies</w:t>
+            </w:r>
+            <w:r>
+              <w:rPr>
+                <w:noProof/>
+                <w:webHidden/>
+              </w:rPr>
+              <w:tab/>
+            </w:r>
+            <w:r>
+              <w:rPr>
+                <w:noProof/>
+                <w:webHidden/>
+              </w:rPr>
+              <w:fldChar w:fldCharType="begin"/>
+            </w:r>
+            <w:r>
+              <w:rPr>
+                <w:noProof/>
+                <w:webHidden/>
+              </w:rPr>
+              <w:instrText xml:space="preserve"> PAGEREF _Toc234269221 \h </w:instrText>
+            </w:r>
+            <w:r>
+              <w:rPr>
+                <w:noProof/>
+                <w:webHidden/>
+              </w:rPr>
+            </w:r>
+            <w:r>
+              <w:rPr>
+                <w:noProof/>
+                <w:webHidden/>
+              </w:rPr>
+              <w:fldChar w:fldCharType="separate"/>
+            </w:r>
+            <w:r>
+              <w:rPr>
+                <w:noProof/>
+                <w:webHidden/>
+              </w:rPr>
+              <w:t>4</w:t>
+            </w:r>
+            <w:r>
+              <w:rPr>
+                <w:noProof/>
+                <w:webHidden/>
+              </w:rPr>
+              <w:fldChar w:fldCharType="end"/>
+            </w:r>
+          </w:hyperlink>
+        </w:p>
+        <w:p>
+          <w:pPr>
+            <w:pStyle w:val="TM2"/>
+            <w:tabs>
+              <w:tab w:val="right" w:leader="dot" w:pos="9062"/>
+            </w:tabs>
+            <w:rPr>
+              <w:rFonts w:eastAsiaTheme="minorEastAsia"/>
+              <w:noProof/>
+              <w:lang w:eastAsia="fr-FR"/>
+            </w:rPr>
+          </w:pPr>
+          <w:hyperlink w:anchor="_Toc234269222" w:history="1">
+            <w:r>
+              <w:rPr>
+                <w:rStyle w:val="Lienhypertexte"/>
+                <w:noProof/>
+              </w:rPr>
+              <w:t>Chacun joue son rôle</w:t>
+            </w:r>
+            <w:r>
+              <w:rPr>
+                <w:noProof/>
+                <w:webHidden/>
+              </w:rPr>
+              <w:tab/>
+            </w:r>
+            <w:r>
+              <w:rPr>
+                <w:noProof/>
+                <w:webHidden/>
+              </w:rPr>
+              <w:fldChar w:fldCharType="begin"/>
+            </w:r>
+            <w:r>
+              <w:rPr>
+                <w:noProof/>
+                <w:webHidden/>
+              </w:rPr>
+              <w:instrText xml:space="preserve"> PAGEREF _Toc234269222 \h </w:instrText>
+            </w:r>
+            <w:r>
+              <w:rPr>
+                <w:noProof/>
+                <w:webHidden/>
+              </w:rPr>
+            </w:r>
+            <w:r>
+              <w:rPr>
+                <w:noProof/>
+                <w:webHidden/>
+              </w:rPr>
+              <w:fldChar w:fldCharType="separate"/>
+            </w:r>
+            <w:r>
+              <w:rPr>
+                <w:noProof/>
+                <w:webHidden/>
+              </w:rPr>
+              <w:t>4</w:t>
+            </w:r>
+            <w:r>
+              <w:rPr>
+                <w:noProof/>
+                <w:webHidden/>
+              </w:rPr>
+              <w:fldChar w:fldCharType="end"/>
+            </w:r>
+          </w:hyperlink>
+        </w:p>
+        <w:p>
+          <w:pPr>
+            <w:pStyle w:val="TM2"/>
+            <w:tabs>
+              <w:tab w:val="right" w:leader="dot" w:pos="9062"/>
+            </w:tabs>
+            <w:rPr>
+              <w:rFonts w:eastAsiaTheme="minorEastAsia"/>
+              <w:noProof/>
+              <w:lang w:eastAsia="fr-FR"/>
+            </w:rPr>
+          </w:pPr>
+          <w:hyperlink w:anchor="_Toc234269223" w:history="1">
+            <w:r>
+              <w:rPr>
+                <w:rStyle w:val="Lienhypertexte"/>
+                <w:noProof/>
+              </w:rPr>
+              <w:t>Caractéristique d’une anomalie</w:t>
+            </w:r>
+            <w:r>
+              <w:rPr>
+                <w:noProof/>
+                <w:webHidden/>
+              </w:rPr>
+              <w:tab/>
+            </w:r>
+            <w:r>
+              <w:rPr>
+                <w:noProof/>
+                <w:webHidden/>
+              </w:rPr>
+              <w:fldChar w:fldCharType="begin"/>
+            </w:r>
+            <w:r>
+              <w:rPr>
+                <w:noProof/>
+                <w:webHidden/>
+              </w:rPr>
+              <w:instrText xml:space="preserve"> PAGEREF _Toc234269223 \h </w:instrText>
             </w:r>
             <w:r>
               <w:rPr>
@@ -323,13 +673,13 @@
               <w:lang w:eastAsia="fr-FR"/>
             </w:rPr>
           </w:pPr>
-          <w:hyperlink w:anchor="_Toc230679307" w:history="1">
+          <w:hyperlink w:anchor="_Toc234269224" w:history="1">
             <w:r>
               <w:rPr>
                 <w:rStyle w:val="Lienhypertexte"/>
                 <w:noProof/>
               </w:rPr>
-              <w:t>Buts de l’algorithmique</w:t>
+              <w:t>Mantis BT</w:t>
             </w:r>
             <w:r>
               <w:rPr>
@@ -350,7 +700,7 @@
                 <w:noProof/>
                 <w:webHidden/>
               </w:rPr>
-              <w:instrText xml:space="preserve"> PAGEREF _Toc230679307 \h </w:instrText>
+              <w:instrText xml:space="preserve"> PAGEREF _Toc234269224 \h </w:instrText>
             </w:r>
             <w:r>
               <w:rPr>
@@ -371,76 +721,6 @@
                 <w:webHidden/>
               </w:rPr>
               <w:t>5</w:t>
-            </w:r>
-            <w:r>
-              <w:rPr>
-                <w:noProof/>
-                <w:webHidden/>
-              </w:rPr>
-              <w:fldChar w:fldCharType="end"/>
-            </w:r>
-          </w:hyperlink>
-        </w:p>
-        <w:p>
-          <w:pPr>
-            <w:pStyle w:val="TM1"/>
-            <w:tabs>
-              <w:tab w:val="right" w:leader="dot" w:pos="9062"/>
-            </w:tabs>
-            <w:rPr>
-              <w:rFonts w:eastAsiaTheme="minorEastAsia"/>
-              <w:noProof/>
-              <w:lang w:eastAsia="fr-FR"/>
-            </w:rPr>
-          </w:pPr>
-          <w:hyperlink w:anchor="_Toc230679308" w:history="1">
-            <w:r>
-              <w:rPr>
-                <w:rStyle w:val="Lienhypertexte"/>
-                <w:noProof/>
-              </w:rPr>
-              <w:t>Pourquoi l’algorithmique</w:t>
-            </w:r>
-            <w:r>
-              <w:rPr>
-                <w:noProof/>
-                <w:webHidden/>
-              </w:rPr>
-              <w:tab/>
-            </w:r>
-            <w:r>
-              <w:rPr>
-                <w:noProof/>
-                <w:webHidden/>
-              </w:rPr>
-              <w:fldChar w:fldCharType="begin"/>
-            </w:r>
-            <w:r>
-              <w:rPr>
-                <w:noProof/>
-                <w:webHidden/>
-              </w:rPr>
-              <w:instrText xml:space="preserve"> PAGEREF _Toc230679308 \h </w:instrText>
-            </w:r>
-            <w:r>
-              <w:rPr>
-                <w:noProof/>
-                <w:webHidden/>
-              </w:rPr>
-            </w:r>
-            <w:r>
-              <w:rPr>
-                <w:noProof/>
-                <w:webHidden/>
-              </w:rPr>
-              <w:fldChar w:fldCharType="separate"/>
-            </w:r>
-            <w:r>
-              <w:rPr>
-                <w:noProof/>
-                <w:webHidden/>
-              </w:rPr>
-              <w:t>6</w:t>
             </w:r>
             <w:r>
               <w:rPr>
@@ -535,13 +815,18 @@
       <w:pPr>
         <w:pStyle w:val="Titre1"/>
       </w:pPr>
+      <w:bookmarkStart w:id="0" w:name="_Toc234269217"/>
       <w:r>
         <w:lastRenderedPageBreak/>
         <w:t>Un peu de vocabulaire</w:t>
       </w:r>
+      <w:bookmarkEnd w:id="0"/>
     </w:p>
     <w:p>
       <w:r>
+        <w:rPr>
+          <w:noProof/>
+        </w:rPr>
         <w:drawing>
           <wp:inline distT="0" distB="0" distL="0" distR="0" wp14:anchorId="283DFCD0" wp14:editId="4865770E">
             <wp:extent cx="6072263" cy="3403600"/>
@@ -584,20 +869,27 @@
       <w:pPr>
         <w:pStyle w:val="Titre1"/>
       </w:pPr>
+      <w:bookmarkStart w:id="1" w:name="_Toc234269218"/>
       <w:r>
         <w:t>Le traitement des anomalies</w:t>
       </w:r>
+      <w:bookmarkEnd w:id="1"/>
     </w:p>
     <w:p>
       <w:pPr>
         <w:pStyle w:val="Titre2"/>
       </w:pPr>
+      <w:bookmarkStart w:id="2" w:name="_Toc234269219"/>
       <w:r>
         <w:t>Une anomalie</w:t>
       </w:r>
+      <w:bookmarkEnd w:id="2"/>
     </w:p>
     <w:p>
       <w:r>
+        <w:rPr>
+          <w:noProof/>
+        </w:rPr>
         <w:drawing>
           <wp:inline distT="0" distB="0" distL="0" distR="0" wp14:anchorId="580737D4" wp14:editId="66C259C6">
             <wp:extent cx="6027313" cy="2311400"/>
@@ -643,13 +935,18 @@
       <w:pPr>
         <w:pStyle w:val="Titre2"/>
       </w:pPr>
+      <w:bookmarkStart w:id="3" w:name="_Toc234269220"/>
       <w:r>
         <w:lastRenderedPageBreak/>
         <w:t>Cycle de vie d’une anomalie</w:t>
       </w:r>
+      <w:bookmarkEnd w:id="3"/>
     </w:p>
     <w:p>
       <w:r>
+        <w:rPr>
+          <w:noProof/>
+        </w:rPr>
         <w:drawing>
           <wp:inline distT="0" distB="0" distL="0" distR="0" wp14:anchorId="3B44416C" wp14:editId="2652CB75">
             <wp:extent cx="6274051" cy="3003550"/>
@@ -692,20 +989,27 @@
       <w:pPr>
         <w:pStyle w:val="Titre1"/>
       </w:pPr>
+      <w:bookmarkStart w:id="4" w:name="_Toc234269221"/>
       <w:r>
         <w:t>Remonter les anomalies</w:t>
       </w:r>
+      <w:bookmarkEnd w:id="4"/>
     </w:p>
     <w:p>
       <w:pPr>
         <w:pStyle w:val="Titre2"/>
       </w:pPr>
+      <w:bookmarkStart w:id="5" w:name="_Toc234269222"/>
       <w:r>
         <w:t>Chacun joue son rôle</w:t>
       </w:r>
+      <w:bookmarkEnd w:id="5"/>
     </w:p>
     <w:p>
       <w:r>
+        <w:rPr>
+          <w:noProof/>
+        </w:rPr>
         <w:drawing>
           <wp:inline distT="0" distB="0" distL="0" distR="0" wp14:anchorId="3C0704A8" wp14:editId="5476BBC8">
             <wp:extent cx="6191250" cy="3661382"/>
@@ -748,13 +1052,18 @@
       <w:pPr>
         <w:pStyle w:val="Titre2"/>
       </w:pPr>
+      <w:bookmarkStart w:id="6" w:name="_Toc234269223"/>
       <w:r>
         <w:lastRenderedPageBreak/>
         <w:t>Caractéristique d’une anomalie</w:t>
       </w:r>
+      <w:bookmarkEnd w:id="6"/>
     </w:p>
     <w:p>
       <w:r>
+        <w:rPr>
+          <w:noProof/>
+        </w:rPr>
         <w:drawing>
           <wp:inline distT="0" distB="0" distL="0" distR="0" wp14:anchorId="753A0939" wp14:editId="2B109C12">
             <wp:extent cx="6242050" cy="3572390"/>
@@ -797,9 +1106,11 @@
       <w:pPr>
         <w:pStyle w:val="Titre1"/>
       </w:pPr>
+      <w:bookmarkStart w:id="7" w:name="_Toc234269224"/>
       <w:r>
         <w:t>Mantis BT</w:t>
       </w:r>
+      <w:bookmarkEnd w:id="7"/>
     </w:p>
     <w:p/>
     <w:p/>
@@ -5705,6 +6016,7 @@
   <w:style w:type="character" w:default="1" w:styleId="Policepardfaut">
     <w:name w:val="Default Paragraph Font"/>
     <w:uiPriority w:val="1"/>
+    <w:semiHidden/>
     <w:unhideWhenUsed/>
   </w:style>
   <w:style w:type="table" w:default="1" w:styleId="TableauNormal">

</xml_diff>